<commit_message>
edits for their locked tracked changes docx
</commit_message>
<xml_diff>
--- a/paper/S2_File.docx
+++ b/paper/S2_File.docx
@@ -217,7 +217,7 @@
         <w:t xml:space="preserve"> </w:t>
       </w:r>
       <w:r>
-        <w:t xml:space="preserve">16,</w:t>
+        <w:t xml:space="preserve">19,</w:t>
       </w:r>
       <w:r>
         <w:t xml:space="preserve"> </w:t>
@@ -10142,6 +10142,9 @@
       <w:r>
         <w:t xml:space="preserve">. Oxford: Archaeopress; 2005. doi:</w:t>
       </w:r>
+      <w:r>
+        <w:t xml:space="preserve"> </w:t>
+      </w:r>
       <w:hyperlink r:id="rId51">
         <w:r>
           <w:rPr>
@@ -10208,6 +10211,9 @@
       <w:r>
         <w:t xml:space="preserve">sequence. J Hum Evol. 2011;61: 549–563. doi:</w:t>
       </w:r>
+      <w:r>
+        <w:t xml:space="preserve"> </w:t>
+      </w:r>
       <w:hyperlink r:id="rId53">
         <w:r>
           <w:rPr>
@@ -10316,6 +10322,9 @@
       <w:r>
         <w:t xml:space="preserve">. J Quat Sci. 2020;35: 961–973. doi:</w:t>
       </w:r>
+      <w:r>
+        <w:t xml:space="preserve"> </w:t>
+      </w:r>
       <w:hyperlink r:id="rId55">
         <w:r>
           <w:rPr>
@@ -10379,6 +10388,9 @@
       <w:r>
         <w:t xml:space="preserve">. Nature. 2005;435: 332–335. doi:</w:t>
       </w:r>
+      <w:r>
+        <w:t xml:space="preserve"> </w:t>
+      </w:r>
       <w:hyperlink r:id="rId57">
         <w:r>
           <w:rPr>
@@ -10460,6 +10472,9 @@
       <w:r>
         <w:t xml:space="preserve">. PLoS One. 2018;13: e0194097. doi:</w:t>
       </w:r>
+      <w:r>
+        <w:t xml:space="preserve"> </w:t>
+      </w:r>
       <w:hyperlink r:id="rId59">
         <w:r>
           <w:rPr>
@@ -10541,6 +10556,9 @@
       <w:r>
         <w:t xml:space="preserve">). Quartar. 2018;65: 7–49. doi:</w:t>
       </w:r>
+      <w:r>
+        <w:t xml:space="preserve"> </w:t>
+      </w:r>
       <w:hyperlink r:id="rId61">
         <w:r>
           <w:rPr>
@@ -10592,6 +10610,9 @@
       <w:r>
         <w:t xml:space="preserve">. Proc Prehist Soc. 2019;85: 29–60. doi:</w:t>
       </w:r>
+      <w:r>
+        <w:t xml:space="preserve"> </w:t>
+      </w:r>
       <w:hyperlink r:id="rId63">
         <w:r>
           <w:rPr>
@@ -10779,6 +10800,9 @@
       <w:r>
         <w:t xml:space="preserve">. Palethnology, Toulouse; 2015. pp. 57–75. doi:</w:t>
       </w:r>
+      <w:r>
+        <w:t xml:space="preserve"> </w:t>
+      </w:r>
       <w:hyperlink r:id="rId66">
         <w:r>
           <w:rPr>
@@ -10842,6 +10866,9 @@
       <w:r>
         <w:t xml:space="preserve">: Using radiocarbon dating to assess site taphonomy. Quat Int. 2018;474: 56–70. doi:</w:t>
       </w:r>
+      <w:r>
+        <w:t xml:space="preserve"> </w:t>
+      </w:r>
       <w:hyperlink r:id="rId68">
         <w:r>
           <w:rPr>
@@ -10884,6 +10911,9 @@
       <w:r>
         <w:t xml:space="preserve">. J Paleolit Archaeol. 2026;9. doi:</w:t>
       </w:r>
+      <w:r>
+        <w:t xml:space="preserve"> </w:t>
+      </w:r>
       <w:hyperlink r:id="rId70">
         <w:r>
           <w:rPr>
@@ -10944,6 +10974,9 @@
       <w:r>
         <w:t xml:space="preserve">. PLoS One. 2017;12: e0189241. doi:</w:t>
       </w:r>
+      <w:r>
+        <w:t xml:space="preserve"> </w:t>
+      </w:r>
       <w:hyperlink r:id="rId72">
         <w:r>
           <w:rPr>
@@ -11004,6 +11037,9 @@
       <w:r>
         <w:t xml:space="preserve">. J Anthropol Sci. 2020;98: 99–140. doi:</w:t>
       </w:r>
+      <w:r>
+        <w:t xml:space="preserve"> </w:t>
+      </w:r>
       <w:hyperlink r:id="rId74">
         <w:r>
           <w:rPr>
@@ -11133,6 +11169,9 @@
       <w:r>
         <w:t xml:space="preserve">). Paleo. 2012;23: 11–38. doi:</w:t>
       </w:r>
+      <w:r>
+        <w:t xml:space="preserve"> </w:t>
+      </w:r>
       <w:hyperlink r:id="rId76">
         <w:r>
           <w:rPr>
@@ -11208,6 +11247,9 @@
       <w:r>
         <w:t xml:space="preserve">and their remains. Vienna: Springer; 2006. pp. 41–74. doi:</w:t>
       </w:r>
+      <w:r>
+        <w:t xml:space="preserve"> </w:t>
+      </w:r>
       <w:hyperlink r:id="rId78">
         <w:r>
           <w:rPr>
@@ -11268,6 +11310,9 @@
       <w:r>
         <w:t xml:space="preserve">. J Hum Evol. 2012;62: 664–676. doi:</w:t>
       </w:r>
+      <w:r>
+        <w:t xml:space="preserve"> </w:t>
+      </w:r>
       <w:hyperlink r:id="rId80">
         <w:r>
           <w:rPr>
@@ -11364,6 +11409,9 @@
       <w:r>
         <w:t xml:space="preserve">model. Paleo. 2003; 69–86. doi:</w:t>
       </w:r>
+      <w:r>
+        <w:t xml:space="preserve"> </w:t>
+      </w:r>
       <w:hyperlink r:id="rId82">
         <w:r>
           <w:rPr>
@@ -11412,6 +11460,9 @@
       <w:r>
         <w:t xml:space="preserve">. PLoS One. 2025;20: e0331921. doi:</w:t>
       </w:r>
+      <w:r>
+        <w:t xml:space="preserve"> </w:t>
+      </w:r>
       <w:hyperlink r:id="rId84">
         <w:r>
           <w:rPr>
@@ -11466,6 +11517,9 @@
       <w:r>
         <w:t xml:space="preserve">fossils. Am J Phys Anthropol. 2009;138: 421–428. doi:</w:t>
       </w:r>
+      <w:r>
+        <w:t xml:space="preserve"> </w:t>
+      </w:r>
       <w:hyperlink r:id="rId86">
         <w:r>
           <w:rPr>
@@ -11555,6 +11609,9 @@
       </w:r>
       <w:r>
         <w:t xml:space="preserve">collections. C R Palevol. 2019;18: 569–586. doi:</w:t>
+      </w:r>
+      <w:r>
+        <w:t xml:space="preserve"> </w:t>
       </w:r>
       <w:hyperlink r:id="rId88">
         <w:r>

</xml_diff>